<commit_message>
Evaluation guide (docx): Skating Speed and Skating Mobility replace Skating and Coachability
Skater table: Skating row split into Speed and Mobility rows with their own
watch-fors and red flags; Coachability row removed; intro reads eight criteria
with the weighting note; summary checklist and goalie note updated.

Co-Authored-By: Claude Fable 5.1 <noreply@anthropic.com>
</commit_message>
<xml_diff>
--- a/docs/U13-Rep-B-Evaluation-Guide.docx
+++ b/docs/U13-Rep-B-Evaluation-Guide.docx
@@ -1006,7 +1006,7 @@
           <w:sz w:val="22"/>
           <w:szCs w:val="22"/>
         </w:rPr>
-        <w:t>These seven criteria apply to every forward and defenceman. Each has a short list of things that show up at U13 Rep B specifically, and the tells that usually mean a lower score. Skating, hockey sense, and compete level are weighted more heavily in the combined ranking because at this age they predict how a player will develop far better than shooting or stickhandling do.</w:t>
+        <w:t>These eight criteria apply to every forward and defenceman. Each has a short list of things that show up at U13 Rep B specifically, and the tells that usually mean a lower score. Hockey sense and compete level are weighted more heavily in the combined ranking because at this age they predict how a player will develop far better than shooting or stickhandling do; skating is scored twice, as speed and as mobility, so it carries the same total weight.</w:t>
       </w:r>
     </w:p>
     <w:tbl>
@@ -1151,7 +1151,7 @@
                 <w:sz w:val="20"/>
                 <w:szCs w:val="20"/>
               </w:rPr>
-              <w:t>Skating (weight 1.5)</w:t>
+              <w:t>Skating Speed (weight 1.0)</w:t>
             </w:r>
           </w:p>
         </w:tc>
@@ -1213,41 +1213,24 @@
                 <w:sz w:val="20"/>
                 <w:szCs w:val="20"/>
               </w:rPr>
-              <w:t>Crossovers both directions, inside and outside edges, tight turns both ways.</w:t>
-            </w:r>
-          </w:p>
-          <w:p>
-            <w:pPr>
-              <w:pStyle w:val="Normal"/>
-              <w:spacing w:before="0" w:after="40"/>
-              <w:rPr/>
-            </w:pPr>
-            <w:r>
-              <w:rPr>
-                <w:rFonts w:eastAsia="Calibri" w:cs="Calibri"/>
-                <w:b w:val="false"/>
-                <w:bCs w:val="false"/>
-                <w:sz w:val="20"/>
-                <w:szCs w:val="20"/>
-              </w:rPr>
-              <w:t>Backward skating and pivots forward-to-backward without losing speed.</w:t>
-            </w:r>
-          </w:p>
-          <w:p>
-            <w:pPr>
-              <w:pStyle w:val="Normal"/>
-              <w:spacing w:before="0" w:after="40"/>
-              <w:rPr/>
-            </w:pPr>
-            <w:r>
-              <w:rPr>
-                <w:rFonts w:eastAsia="Calibri" w:cs="Calibri"/>
-                <w:b w:val="false"/>
-                <w:bCs w:val="false"/>
-                <w:sz w:val="20"/>
-                <w:szCs w:val="20"/>
-              </w:rPr>
-              <w:t>Hard stops both sides and quick first three strides.</w:t>
+              <w:t>Quick first three strides; accelerates out of stops and turns.</w:t>
+            </w:r>
+          </w:p>
+          <w:p>
+            <w:pPr>
+              <w:pStyle w:val="Normal"/>
+              <w:spacing w:before="0" w:after="40"/>
+              <w:rPr/>
+            </w:pPr>
+            <w:r>
+              <w:rPr>
+                <w:rFonts w:eastAsia="Calibri" w:cs="Calibri"/>
+                <w:b w:val="false"/>
+                <w:bCs w:val="false"/>
+                <w:sz w:val="20"/>
+                <w:szCs w:val="20"/>
+              </w:rPr>
+              <w:t>Keeps pace with the play for a whole shift, not just the first one.</w:t>
             </w:r>
           </w:p>
         </w:tc>
@@ -1275,7 +1258,7 @@
                 <w:sz w:val="20"/>
                 <w:szCs w:val="20"/>
               </w:rPr>
-              <w:t>Only turns one way. Loses the puck in tight turns. Backward skating is a shuffle. Slow to get going after a stop. Upright posture that gets knocked off balance easily.</w:t>
+              <w:t>Slow to get going after a stop. Loses ground in a straight race. Choppy stride with no glide. Looks busy but goes nowhere; fades late in a shift.</w:t>
             </w:r>
           </w:p>
         </w:tc>
@@ -1293,7 +1276,6 @@
               <w:bottom w:val="single" w:sz="4" w:space="0" w:color="000000"/>
               <w:end w:val="single" w:sz="4" w:space="0" w:color="000000"/>
             </w:tcBorders>
-            <w:shd w:color="auto" w:fill="EAF0F7" w:val="clear"/>
           </w:tcPr>
           <w:p>
             <w:pPr>
@@ -1309,7 +1291,7 @@
                 <w:sz w:val="20"/>
                 <w:szCs w:val="20"/>
               </w:rPr>
-              <w:t>Puck Control (weight 1.0)</w:t>
+              <w:t>Skating Mobility (weight 1.0)</w:t>
             </w:r>
           </w:p>
         </w:tc>
@@ -1322,74 +1304,73 @@
               <w:bottom w:val="single" w:sz="4" w:space="0" w:color="000000"/>
               <w:end w:val="single" w:sz="4" w:space="0" w:color="000000"/>
             </w:tcBorders>
-            <w:shd w:color="auto" w:fill="EAF0F7" w:val="clear"/>
-          </w:tcPr>
-          <w:p>
-            <w:pPr>
-              <w:pStyle w:val="Normal"/>
-              <w:spacing w:before="0" w:after="40"/>
-              <w:rPr/>
-            </w:pPr>
-            <w:r>
-              <w:rPr>
-                <w:rFonts w:eastAsia="Calibri" w:cs="Calibri"/>
-                <w:b w:val="false"/>
-                <w:bCs w:val="false"/>
-                <w:sz w:val="20"/>
-                <w:szCs w:val="20"/>
-              </w:rPr>
-              <w:t>Head up while carrying the puck, especially through traffic.</w:t>
-            </w:r>
-          </w:p>
-          <w:p>
-            <w:pPr>
-              <w:pStyle w:val="Normal"/>
-              <w:spacing w:before="0" w:after="40"/>
-              <w:rPr/>
-            </w:pPr>
-            <w:r>
-              <w:rPr>
-                <w:rFonts w:eastAsia="Calibri" w:cs="Calibri"/>
-                <w:b w:val="false"/>
-                <w:bCs w:val="false"/>
-                <w:sz w:val="20"/>
-                <w:szCs w:val="20"/>
-              </w:rPr>
-              <w:t>Protects the puck with body position, not just stick reach.</w:t>
-            </w:r>
-          </w:p>
-          <w:p>
-            <w:pPr>
-              <w:pStyle w:val="Normal"/>
-              <w:spacing w:before="0" w:after="40"/>
-              <w:rPr/>
-            </w:pPr>
-            <w:r>
-              <w:rPr>
-                <w:rFonts w:eastAsia="Calibri" w:cs="Calibri"/>
-                <w:b w:val="false"/>
-                <w:bCs w:val="false"/>
-                <w:sz w:val="20"/>
-                <w:szCs w:val="20"/>
-              </w:rPr>
-              <w:t>Receives hard, bouncing, or in-the-skates passes cleanly.</w:t>
-            </w:r>
-          </w:p>
-          <w:p>
-            <w:pPr>
-              <w:pStyle w:val="Normal"/>
-              <w:spacing w:before="0" w:after="40"/>
-              <w:rPr/>
-            </w:pPr>
-            <w:r>
-              <w:rPr>
-                <w:rFonts w:eastAsia="Calibri" w:cs="Calibri"/>
-                <w:b w:val="false"/>
-                <w:bCs w:val="false"/>
-                <w:sz w:val="20"/>
-                <w:szCs w:val="20"/>
-              </w:rPr>
-              <w:t>Handles the puck at full speed, not only when slowing down.</w:t>
+          </w:tcPr>
+          <w:p>
+            <w:pPr>
+              <w:pStyle w:val="Normal"/>
+              <w:spacing w:before="0" w:after="40"/>
+              <w:rPr/>
+            </w:pPr>
+            <w:r>
+              <w:rPr>
+                <w:rFonts w:eastAsia="Calibri" w:cs="Calibri"/>
+                <w:b w:val="false"/>
+                <w:bCs w:val="false"/>
+                <w:sz w:val="20"/>
+                <w:szCs w:val="20"/>
+              </w:rPr>
+              <w:t>Crossovers both directions, inside and outside edges, tight turns both ways.</w:t>
+            </w:r>
+          </w:p>
+          <w:p>
+            <w:pPr>
+              <w:pStyle w:val="Normal"/>
+              <w:spacing w:before="0" w:after="40"/>
+              <w:rPr/>
+            </w:pPr>
+            <w:r>
+              <w:rPr>
+                <w:rFonts w:eastAsia="Calibri" w:cs="Calibri"/>
+                <w:b w:val="false"/>
+                <w:bCs w:val="false"/>
+                <w:sz w:val="20"/>
+                <w:szCs w:val="20"/>
+              </w:rPr>
+              <w:t>Backward skating and pivots forward-to-backward without losing speed.</w:t>
+            </w:r>
+          </w:p>
+          <w:p>
+            <w:pPr>
+              <w:pStyle w:val="Normal"/>
+              <w:spacing w:before="0" w:after="40"/>
+              <w:rPr/>
+            </w:pPr>
+            <w:r>
+              <w:rPr>
+                <w:rFonts w:eastAsia="Calibri" w:cs="Calibri"/>
+                <w:b w:val="false"/>
+                <w:bCs w:val="false"/>
+                <w:sz w:val="20"/>
+                <w:szCs w:val="20"/>
+              </w:rPr>
+              <w:t>Hard stops both sides; changes direction without slowing down.</w:t>
+            </w:r>
+          </w:p>
+          <w:p>
+            <w:pPr>
+              <w:pStyle w:val="Normal"/>
+              <w:spacing w:before="0" w:after="40"/>
+              <w:rPr/>
+            </w:pPr>
+            <w:r>
+              <w:rPr>
+                <w:rFonts w:eastAsia="Calibri" w:cs="Calibri"/>
+                <w:b w:val="false"/>
+                <w:bCs w:val="false"/>
+                <w:sz w:val="20"/>
+                <w:szCs w:val="20"/>
+              </w:rPr>
+              <w:t>Stays balanced through contact and on the puck in tight areas.</w:t>
             </w:r>
           </w:p>
         </w:tc>
@@ -1402,23 +1383,22 @@
               <w:bottom w:val="single" w:sz="4" w:space="0" w:color="000000"/>
               <w:end w:val="single" w:sz="4" w:space="0" w:color="000000"/>
             </w:tcBorders>
-            <w:shd w:color="auto" w:fill="EAF0F7" w:val="clear"/>
-          </w:tcPr>
-          <w:p>
-            <w:pPr>
-              <w:pStyle w:val="Normal"/>
-              <w:spacing w:before="0" w:after="40"/>
-              <w:rPr/>
-            </w:pPr>
-            <w:r>
-              <w:rPr>
-                <w:rFonts w:eastAsia="Calibri" w:cs="Calibri"/>
-                <w:b w:val="false"/>
-                <w:bCs w:val="false"/>
-                <w:sz w:val="20"/>
-                <w:szCs w:val="20"/>
-              </w:rPr>
-              <w:t>Looks down at the puck constantly. Stickhandles in open ice for show but loses it under pressure. Skates around the puck rather than through the play.</w:t>
+          </w:tcPr>
+          <w:p>
+            <w:pPr>
+              <w:pStyle w:val="Normal"/>
+              <w:spacing w:before="0" w:after="40"/>
+              <w:rPr/>
+            </w:pPr>
+            <w:r>
+              <w:rPr>
+                <w:rFonts w:eastAsia="Calibri" w:cs="Calibri"/>
+                <w:b w:val="false"/>
+                <w:bCs w:val="false"/>
+                <w:sz w:val="20"/>
+                <w:szCs w:val="20"/>
+              </w:rPr>
+              <w:t>Only turns one way. Loses the puck in tight turns. Backward skating is a shuffle. Upright posture that gets knocked off balance easily.</w:t>
             </w:r>
           </w:p>
         </w:tc>
@@ -1436,6 +1416,7 @@
               <w:bottom w:val="single" w:sz="4" w:space="0" w:color="000000"/>
               <w:end w:val="single" w:sz="4" w:space="0" w:color="000000"/>
             </w:tcBorders>
+            <w:shd w:color="auto" w:fill="EAF0F7" w:val="clear"/>
           </w:tcPr>
           <w:p>
             <w:pPr>
@@ -1451,7 +1432,7 @@
                 <w:sz w:val="20"/>
                 <w:szCs w:val="20"/>
               </w:rPr>
-              <w:t>Passing (weight 1.0)</w:t>
+              <w:t>Puck Control (weight 1.0)</w:t>
             </w:r>
           </w:p>
         </w:tc>
@@ -1464,73 +1445,74 @@
               <w:bottom w:val="single" w:sz="4" w:space="0" w:color="000000"/>
               <w:end w:val="single" w:sz="4" w:space="0" w:color="000000"/>
             </w:tcBorders>
-          </w:tcPr>
-          <w:p>
-            <w:pPr>
-              <w:pStyle w:val="Normal"/>
-              <w:spacing w:before="0" w:after="40"/>
-              <w:rPr/>
-            </w:pPr>
-            <w:r>
-              <w:rPr>
-                <w:rFonts w:eastAsia="Calibri" w:cs="Calibri"/>
-                <w:b w:val="false"/>
-                <w:bCs w:val="false"/>
-                <w:sz w:val="20"/>
-                <w:szCs w:val="20"/>
-              </w:rPr>
-              <w:t>Tape-to-tape on forehand and backhand under pressure.</w:t>
-            </w:r>
-          </w:p>
-          <w:p>
-            <w:pPr>
-              <w:pStyle w:val="Normal"/>
-              <w:spacing w:before="0" w:after="40"/>
-              <w:rPr/>
-            </w:pPr>
-            <w:r>
-              <w:rPr>
-                <w:rFonts w:eastAsia="Calibri" w:cs="Calibri"/>
-                <w:b w:val="false"/>
-                <w:bCs w:val="false"/>
-                <w:sz w:val="20"/>
-                <w:szCs w:val="20"/>
-              </w:rPr>
-              <w:t>Passes to where a teammate is going, not where they are.</w:t>
-            </w:r>
-          </w:p>
-          <w:p>
-            <w:pPr>
-              <w:pStyle w:val="Normal"/>
-              <w:spacing w:before="0" w:after="40"/>
-              <w:rPr/>
-            </w:pPr>
-            <w:r>
-              <w:rPr>
-                <w:rFonts w:eastAsia="Calibri" w:cs="Calibri"/>
-                <w:b w:val="false"/>
-                <w:bCs w:val="false"/>
-                <w:sz w:val="20"/>
-                <w:szCs w:val="20"/>
-              </w:rPr>
-              <w:t>Looks before passing; picks the open option rather than the first one.</w:t>
-            </w:r>
-          </w:p>
-          <w:p>
-            <w:pPr>
-              <w:pStyle w:val="Normal"/>
-              <w:spacing w:before="0" w:after="40"/>
-              <w:rPr/>
-            </w:pPr>
-            <w:r>
-              <w:rPr>
-                <w:rFonts w:eastAsia="Calibri" w:cs="Calibri"/>
-                <w:b w:val="false"/>
-                <w:bCs w:val="false"/>
-                <w:sz w:val="20"/>
-                <w:szCs w:val="20"/>
-              </w:rPr>
-              <w:t>Hard, flat passes with good timing; sauce when needed to clear a stick.</w:t>
+            <w:shd w:color="auto" w:fill="EAF0F7" w:val="clear"/>
+          </w:tcPr>
+          <w:p>
+            <w:pPr>
+              <w:pStyle w:val="Normal"/>
+              <w:spacing w:before="0" w:after="40"/>
+              <w:rPr/>
+            </w:pPr>
+            <w:r>
+              <w:rPr>
+                <w:rFonts w:eastAsia="Calibri" w:cs="Calibri"/>
+                <w:b w:val="false"/>
+                <w:bCs w:val="false"/>
+                <w:sz w:val="20"/>
+                <w:szCs w:val="20"/>
+              </w:rPr>
+              <w:t>Head up while carrying the puck, especially through traffic.</w:t>
+            </w:r>
+          </w:p>
+          <w:p>
+            <w:pPr>
+              <w:pStyle w:val="Normal"/>
+              <w:spacing w:before="0" w:after="40"/>
+              <w:rPr/>
+            </w:pPr>
+            <w:r>
+              <w:rPr>
+                <w:rFonts w:eastAsia="Calibri" w:cs="Calibri"/>
+                <w:b w:val="false"/>
+                <w:bCs w:val="false"/>
+                <w:sz w:val="20"/>
+                <w:szCs w:val="20"/>
+              </w:rPr>
+              <w:t>Protects the puck with body position, not just stick reach.</w:t>
+            </w:r>
+          </w:p>
+          <w:p>
+            <w:pPr>
+              <w:pStyle w:val="Normal"/>
+              <w:spacing w:before="0" w:after="40"/>
+              <w:rPr/>
+            </w:pPr>
+            <w:r>
+              <w:rPr>
+                <w:rFonts w:eastAsia="Calibri" w:cs="Calibri"/>
+                <w:b w:val="false"/>
+                <w:bCs w:val="false"/>
+                <w:sz w:val="20"/>
+                <w:szCs w:val="20"/>
+              </w:rPr>
+              <w:t>Receives hard, bouncing, or in-the-skates passes cleanly.</w:t>
+            </w:r>
+          </w:p>
+          <w:p>
+            <w:pPr>
+              <w:pStyle w:val="Normal"/>
+              <w:spacing w:before="0" w:after="40"/>
+              <w:rPr/>
+            </w:pPr>
+            <w:r>
+              <w:rPr>
+                <w:rFonts w:eastAsia="Calibri" w:cs="Calibri"/>
+                <w:b w:val="false"/>
+                <w:bCs w:val="false"/>
+                <w:sz w:val="20"/>
+                <w:szCs w:val="20"/>
+              </w:rPr>
+              <w:t>Handles the puck at full speed, not only when slowing down.</w:t>
             </w:r>
           </w:p>
         </w:tc>
@@ -1543,22 +1525,23 @@
               <w:bottom w:val="single" w:sz="4" w:space="0" w:color="000000"/>
               <w:end w:val="single" w:sz="4" w:space="0" w:color="000000"/>
             </w:tcBorders>
-          </w:tcPr>
-          <w:p>
-            <w:pPr>
-              <w:pStyle w:val="Normal"/>
-              <w:spacing w:before="0" w:after="40"/>
-              <w:rPr/>
-            </w:pPr>
-            <w:r>
-              <w:rPr>
-                <w:rFonts w:eastAsia="Calibri" w:cs="Calibri"/>
-                <w:b w:val="false"/>
-                <w:bCs w:val="false"/>
-                <w:sz w:val="20"/>
-                <w:szCs w:val="20"/>
-              </w:rPr>
-              <w:t>Passes into skates or behind the receiver. Passes blindly to the middle. Throws the puck away when pressured. Never uses the backhand.</w:t>
+            <w:shd w:color="auto" w:fill="EAF0F7" w:val="clear"/>
+          </w:tcPr>
+          <w:p>
+            <w:pPr>
+              <w:pStyle w:val="Normal"/>
+              <w:spacing w:before="0" w:after="40"/>
+              <w:rPr/>
+            </w:pPr>
+            <w:r>
+              <w:rPr>
+                <w:rFonts w:eastAsia="Calibri" w:cs="Calibri"/>
+                <w:b w:val="false"/>
+                <w:bCs w:val="false"/>
+                <w:sz w:val="20"/>
+                <w:szCs w:val="20"/>
+              </w:rPr>
+              <w:t>Looks down at the puck constantly. Stickhandles in open ice for show but loses it under pressure. Skates around the puck rather than through the play.</w:t>
             </w:r>
           </w:p>
         </w:tc>
@@ -1576,7 +1559,6 @@
               <w:bottom w:val="single" w:sz="4" w:space="0" w:color="000000"/>
               <w:end w:val="single" w:sz="4" w:space="0" w:color="000000"/>
             </w:tcBorders>
-            <w:shd w:color="auto" w:fill="EAF0F7" w:val="clear"/>
           </w:tcPr>
           <w:p>
             <w:pPr>
@@ -1592,7 +1574,7 @@
                 <w:sz w:val="20"/>
                 <w:szCs w:val="20"/>
               </w:rPr>
-              <w:t>Shooting (weight 1.0)</w:t>
+              <w:t>Passing (weight 1.0)</w:t>
             </w:r>
           </w:p>
         </w:tc>
@@ -1605,74 +1587,73 @@
               <w:bottom w:val="single" w:sz="4" w:space="0" w:color="000000"/>
               <w:end w:val="single" w:sz="4" w:space="0" w:color="000000"/>
             </w:tcBorders>
-            <w:shd w:color="auto" w:fill="EAF0F7" w:val="clear"/>
-          </w:tcPr>
-          <w:p>
-            <w:pPr>
-              <w:pStyle w:val="Normal"/>
-              <w:spacing w:before="0" w:after="40"/>
-              <w:rPr/>
-            </w:pPr>
-            <w:r>
-              <w:rPr>
-                <w:rFonts w:eastAsia="Calibri" w:cs="Calibri"/>
-                <w:b w:val="false"/>
-                <w:bCs w:val="false"/>
-                <w:sz w:val="20"/>
-                <w:szCs w:val="20"/>
-              </w:rPr>
-              <w:t>Quick release; does not need to stop and wind up.</w:t>
-            </w:r>
-          </w:p>
-          <w:p>
-            <w:pPr>
-              <w:pStyle w:val="Normal"/>
-              <w:spacing w:before="0" w:after="40"/>
-              <w:rPr/>
-            </w:pPr>
-            <w:r>
-              <w:rPr>
-                <w:rFonts w:eastAsia="Calibri" w:cs="Calibri"/>
-                <w:b w:val="false"/>
-                <w:bCs w:val="false"/>
-                <w:sz w:val="20"/>
-                <w:szCs w:val="20"/>
-              </w:rPr>
-              <w:t>Shoots in stride and off either foot.</w:t>
-            </w:r>
-          </w:p>
-          <w:p>
-            <w:pPr>
-              <w:pStyle w:val="Normal"/>
-              <w:spacing w:before="0" w:after="40"/>
-              <w:rPr/>
-            </w:pPr>
-            <w:r>
-              <w:rPr>
-                <w:rFonts w:eastAsia="Calibri" w:cs="Calibri"/>
-                <w:b w:val="false"/>
-                <w:bCs w:val="false"/>
-                <w:sz w:val="20"/>
-                <w:szCs w:val="20"/>
-              </w:rPr>
-              <w:t>Accuracy: picks corners in drills, hits the net in games.</w:t>
-            </w:r>
-          </w:p>
-          <w:p>
-            <w:pPr>
-              <w:pStyle w:val="Normal"/>
-              <w:spacing w:before="0" w:after="40"/>
-              <w:rPr/>
-            </w:pPr>
-            <w:r>
-              <w:rPr>
-                <w:rFonts w:eastAsia="Calibri" w:cs="Calibri"/>
-                <w:b w:val="false"/>
-                <w:bCs w:val="false"/>
-                <w:sz w:val="20"/>
-                <w:szCs w:val="20"/>
-              </w:rPr>
-              <w:t>Shot selection: shoots when there is a lane, passes when there is not.</w:t>
+          </w:tcPr>
+          <w:p>
+            <w:pPr>
+              <w:pStyle w:val="Normal"/>
+              <w:spacing w:before="0" w:after="40"/>
+              <w:rPr/>
+            </w:pPr>
+            <w:r>
+              <w:rPr>
+                <w:rFonts w:eastAsia="Calibri" w:cs="Calibri"/>
+                <w:b w:val="false"/>
+                <w:bCs w:val="false"/>
+                <w:sz w:val="20"/>
+                <w:szCs w:val="20"/>
+              </w:rPr>
+              <w:t>Tape-to-tape on forehand and backhand under pressure.</w:t>
+            </w:r>
+          </w:p>
+          <w:p>
+            <w:pPr>
+              <w:pStyle w:val="Normal"/>
+              <w:spacing w:before="0" w:after="40"/>
+              <w:rPr/>
+            </w:pPr>
+            <w:r>
+              <w:rPr>
+                <w:rFonts w:eastAsia="Calibri" w:cs="Calibri"/>
+                <w:b w:val="false"/>
+                <w:bCs w:val="false"/>
+                <w:sz w:val="20"/>
+                <w:szCs w:val="20"/>
+              </w:rPr>
+              <w:t>Passes to where a teammate is going, not where they are.</w:t>
+            </w:r>
+          </w:p>
+          <w:p>
+            <w:pPr>
+              <w:pStyle w:val="Normal"/>
+              <w:spacing w:before="0" w:after="40"/>
+              <w:rPr/>
+            </w:pPr>
+            <w:r>
+              <w:rPr>
+                <w:rFonts w:eastAsia="Calibri" w:cs="Calibri"/>
+                <w:b w:val="false"/>
+                <w:bCs w:val="false"/>
+                <w:sz w:val="20"/>
+                <w:szCs w:val="20"/>
+              </w:rPr>
+              <w:t>Looks before passing; picks the open option rather than the first one.</w:t>
+            </w:r>
+          </w:p>
+          <w:p>
+            <w:pPr>
+              <w:pStyle w:val="Normal"/>
+              <w:spacing w:before="0" w:after="40"/>
+              <w:rPr/>
+            </w:pPr>
+            <w:r>
+              <w:rPr>
+                <w:rFonts w:eastAsia="Calibri" w:cs="Calibri"/>
+                <w:b w:val="false"/>
+                <w:bCs w:val="false"/>
+                <w:sz w:val="20"/>
+                <w:szCs w:val="20"/>
+              </w:rPr>
+              <w:t>Hard, flat passes with good timing; sauce when needed to clear a stick.</w:t>
             </w:r>
           </w:p>
         </w:tc>
@@ -1685,23 +1666,22 @@
               <w:bottom w:val="single" w:sz="4" w:space="0" w:color="000000"/>
               <w:end w:val="single" w:sz="4" w:space="0" w:color="000000"/>
             </w:tcBorders>
-            <w:shd w:color="auto" w:fill="EAF0F7" w:val="clear"/>
-          </w:tcPr>
-          <w:p>
-            <w:pPr>
-              <w:pStyle w:val="Normal"/>
-              <w:spacing w:before="0" w:after="40"/>
-              <w:rPr/>
-            </w:pPr>
-            <w:r>
-              <w:rPr>
-                <w:rFonts w:eastAsia="Calibri" w:cs="Calibri"/>
-                <w:b w:val="false"/>
-                <w:bCs w:val="false"/>
-                <w:sz w:val="20"/>
-                <w:szCs w:val="20"/>
-              </w:rPr>
-              <w:t>Always takes the big slap shot. Shoots into shin pads. Passes up good shots looking for a perfect one. Misses the net regularly.</w:t>
+          </w:tcPr>
+          <w:p>
+            <w:pPr>
+              <w:pStyle w:val="Normal"/>
+              <w:spacing w:before="0" w:after="40"/>
+              <w:rPr/>
+            </w:pPr>
+            <w:r>
+              <w:rPr>
+                <w:rFonts w:eastAsia="Calibri" w:cs="Calibri"/>
+                <w:b w:val="false"/>
+                <w:bCs w:val="false"/>
+                <w:sz w:val="20"/>
+                <w:szCs w:val="20"/>
+              </w:rPr>
+              <w:t>Passes into skates or behind the receiver. Passes blindly to the middle. Throws the puck away when pressured. Never uses the backhand.</w:t>
             </w:r>
           </w:p>
         </w:tc>
@@ -1719,6 +1699,7 @@
               <w:bottom w:val="single" w:sz="4" w:space="0" w:color="000000"/>
               <w:end w:val="single" w:sz="4" w:space="0" w:color="000000"/>
             </w:tcBorders>
+            <w:shd w:color="auto" w:fill="EAF0F7" w:val="clear"/>
           </w:tcPr>
           <w:p>
             <w:pPr>
@@ -1734,7 +1715,7 @@
                 <w:sz w:val="20"/>
                 <w:szCs w:val="20"/>
               </w:rPr>
-              <w:t>Hockey Sense (weight 1.5)</w:t>
+              <w:t>Shooting (weight 1.0)</w:t>
             </w:r>
           </w:p>
         </w:tc>
@@ -1747,90 +1728,74 @@
               <w:bottom w:val="single" w:sz="4" w:space="0" w:color="000000"/>
               <w:end w:val="single" w:sz="4" w:space="0" w:color="000000"/>
             </w:tcBorders>
-          </w:tcPr>
-          <w:p>
-            <w:pPr>
-              <w:pStyle w:val="Normal"/>
-              <w:spacing w:before="0" w:after="40"/>
-              <w:rPr/>
-            </w:pPr>
-            <w:r>
-              <w:rPr>
-                <w:rFonts w:eastAsia="Calibri" w:cs="Calibri"/>
-                <w:b w:val="false"/>
-                <w:bCs w:val="false"/>
-                <w:sz w:val="20"/>
-                <w:szCs w:val="20"/>
-              </w:rPr>
-              <w:t>In the right place before the puck arrives.</w:t>
-            </w:r>
-          </w:p>
-          <w:p>
-            <w:pPr>
-              <w:pStyle w:val="Normal"/>
-              <w:spacing w:before="0" w:after="40"/>
-              <w:rPr/>
-            </w:pPr>
-            <w:r>
-              <w:rPr>
-                <w:rFonts w:eastAsia="Calibri" w:cs="Calibri"/>
-                <w:b w:val="false"/>
-                <w:bCs w:val="false"/>
-                <w:sz w:val="20"/>
-                <w:szCs w:val="20"/>
-              </w:rPr>
-              <w:t>Supports the puck carrier: gets open, gives a passing option.</w:t>
-            </w:r>
-          </w:p>
-          <w:p>
-            <w:pPr>
-              <w:pStyle w:val="Normal"/>
-              <w:spacing w:before="0" w:after="40"/>
-              <w:rPr/>
-            </w:pPr>
-            <w:r>
-              <w:rPr>
-                <w:rFonts w:eastAsia="Calibri" w:cs="Calibri"/>
-                <w:b w:val="false"/>
-                <w:bCs w:val="false"/>
-                <w:sz w:val="20"/>
-                <w:szCs w:val="20"/>
-              </w:rPr>
-              <w:t>Reads the play: anticipates turnovers, sees the second pass.</w:t>
-            </w:r>
-          </w:p>
-          <w:p>
-            <w:pPr>
-              <w:pStyle w:val="Normal"/>
-              <w:spacing w:before="0" w:after="40"/>
-              <w:rPr/>
-            </w:pPr>
-            <w:r>
-              <w:rPr>
-                <w:rFonts w:eastAsia="Calibri" w:cs="Calibri"/>
-                <w:b w:val="false"/>
-                <w:bCs w:val="false"/>
-                <w:sz w:val="20"/>
-                <w:szCs w:val="20"/>
-              </w:rPr>
-              <w:t>Makes the simple play when the fancy one is not there.</w:t>
-            </w:r>
-          </w:p>
-          <w:p>
-            <w:pPr>
-              <w:pStyle w:val="Normal"/>
-              <w:spacing w:before="0" w:after="40"/>
-              <w:rPr/>
-            </w:pPr>
-            <w:r>
-              <w:rPr>
-                <w:rFonts w:eastAsia="Calibri" w:cs="Calibri"/>
-                <w:b w:val="false"/>
-                <w:bCs w:val="false"/>
-                <w:sz w:val="20"/>
-                <w:szCs w:val="20"/>
-              </w:rPr>
-              <w:t>Recognises odd-man situations for and against and adjusts.</w:t>
+            <w:shd w:color="auto" w:fill="EAF0F7" w:val="clear"/>
+          </w:tcPr>
+          <w:p>
+            <w:pPr>
+              <w:pStyle w:val="Normal"/>
+              <w:spacing w:before="0" w:after="40"/>
+              <w:rPr/>
+            </w:pPr>
+            <w:r>
+              <w:rPr>
+                <w:rFonts w:eastAsia="Calibri" w:cs="Calibri"/>
+                <w:b w:val="false"/>
+                <w:bCs w:val="false"/>
+                <w:sz w:val="20"/>
+                <w:szCs w:val="20"/>
+              </w:rPr>
+              <w:t>Quick release; does not need to stop and wind up.</w:t>
+            </w:r>
+          </w:p>
+          <w:p>
+            <w:pPr>
+              <w:pStyle w:val="Normal"/>
+              <w:spacing w:before="0" w:after="40"/>
+              <w:rPr/>
+            </w:pPr>
+            <w:r>
+              <w:rPr>
+                <w:rFonts w:eastAsia="Calibri" w:cs="Calibri"/>
+                <w:b w:val="false"/>
+                <w:bCs w:val="false"/>
+                <w:sz w:val="20"/>
+                <w:szCs w:val="20"/>
+              </w:rPr>
+              <w:t>Shoots in stride and off either foot.</w:t>
+            </w:r>
+          </w:p>
+          <w:p>
+            <w:pPr>
+              <w:pStyle w:val="Normal"/>
+              <w:spacing w:before="0" w:after="40"/>
+              <w:rPr/>
+            </w:pPr>
+            <w:r>
+              <w:rPr>
+                <w:rFonts w:eastAsia="Calibri" w:cs="Calibri"/>
+                <w:b w:val="false"/>
+                <w:bCs w:val="false"/>
+                <w:sz w:val="20"/>
+                <w:szCs w:val="20"/>
+              </w:rPr>
+              <w:t>Accuracy: picks corners in drills, hits the net in games.</w:t>
+            </w:r>
+          </w:p>
+          <w:p>
+            <w:pPr>
+              <w:pStyle w:val="Normal"/>
+              <w:spacing w:before="0" w:after="40"/>
+              <w:rPr/>
+            </w:pPr>
+            <w:r>
+              <w:rPr>
+                <w:rFonts w:eastAsia="Calibri" w:cs="Calibri"/>
+                <w:b w:val="false"/>
+                <w:bCs w:val="false"/>
+                <w:sz w:val="20"/>
+                <w:szCs w:val="20"/>
+              </w:rPr>
+              <w:t>Shot selection: shoots when there is a lane, passes when there is not.</w:t>
             </w:r>
           </w:p>
         </w:tc>
@@ -1843,22 +1808,23 @@
               <w:bottom w:val="single" w:sz="4" w:space="0" w:color="000000"/>
               <w:end w:val="single" w:sz="4" w:space="0" w:color="000000"/>
             </w:tcBorders>
-          </w:tcPr>
-          <w:p>
-            <w:pPr>
-              <w:pStyle w:val="Normal"/>
-              <w:spacing w:before="0" w:after="40"/>
-              <w:rPr/>
-            </w:pPr>
-            <w:r>
-              <w:rPr>
-                <w:rFonts w:eastAsia="Calibri" w:cs="Calibri"/>
-                <w:b w:val="false"/>
-                <w:bCs w:val="false"/>
-                <w:sz w:val="20"/>
-                <w:szCs w:val="20"/>
-              </w:rPr>
-              <w:t>Chases the puck. Bunches up with teammates. Stands still without the puck. Makes the same wrong read repeatedly. Only looks good when the puck is on their stick.</w:t>
+            <w:shd w:color="auto" w:fill="EAF0F7" w:val="clear"/>
+          </w:tcPr>
+          <w:p>
+            <w:pPr>
+              <w:pStyle w:val="Normal"/>
+              <w:spacing w:before="0" w:after="40"/>
+              <w:rPr/>
+            </w:pPr>
+            <w:r>
+              <w:rPr>
+                <w:rFonts w:eastAsia="Calibri" w:cs="Calibri"/>
+                <w:b w:val="false"/>
+                <w:bCs w:val="false"/>
+                <w:sz w:val="20"/>
+                <w:szCs w:val="20"/>
+              </w:rPr>
+              <w:t>Always takes the big slap shot. Shoots into shin pads. Passes up good shots looking for a perfect one. Misses the net regularly.</w:t>
             </w:r>
           </w:p>
         </w:tc>
@@ -1876,7 +1842,6 @@
               <w:bottom w:val="single" w:sz="4" w:space="0" w:color="000000"/>
               <w:end w:val="single" w:sz="4" w:space="0" w:color="000000"/>
             </w:tcBorders>
-            <w:shd w:color="auto" w:fill="EAF0F7" w:val="clear"/>
           </w:tcPr>
           <w:p>
             <w:pPr>
@@ -1892,7 +1857,7 @@
                 <w:sz w:val="20"/>
                 <w:szCs w:val="20"/>
               </w:rPr>
-              <w:t>Compete Level (weight 1.5)</w:t>
+              <w:t>Hockey Sense (weight 1.5)</w:t>
             </w:r>
           </w:p>
         </w:tc>
@@ -1905,91 +1870,90 @@
               <w:bottom w:val="single" w:sz="4" w:space="0" w:color="000000"/>
               <w:end w:val="single" w:sz="4" w:space="0" w:color="000000"/>
             </w:tcBorders>
-            <w:shd w:color="auto" w:fill="EAF0F7" w:val="clear"/>
-          </w:tcPr>
-          <w:p>
-            <w:pPr>
-              <w:pStyle w:val="Normal"/>
-              <w:spacing w:before="0" w:after="40"/>
-              <w:rPr/>
-            </w:pPr>
-            <w:r>
-              <w:rPr>
-                <w:rFonts w:eastAsia="Calibri" w:cs="Calibri"/>
-                <w:b w:val="false"/>
-                <w:bCs w:val="false"/>
-                <w:sz w:val="20"/>
-                <w:szCs w:val="20"/>
-              </w:rPr>
-              <w:t>Wins or at least contests every puck battle along the boards.</w:t>
-            </w:r>
-          </w:p>
-          <w:p>
-            <w:pPr>
-              <w:pStyle w:val="Normal"/>
-              <w:spacing w:before="0" w:after="40"/>
-              <w:rPr/>
-            </w:pPr>
-            <w:r>
-              <w:rPr>
-                <w:rFonts w:eastAsia="Calibri" w:cs="Calibri"/>
-                <w:b w:val="false"/>
-                <w:bCs w:val="false"/>
-                <w:sz w:val="20"/>
-                <w:szCs w:val="20"/>
-              </w:rPr>
-              <w:t>Back-checks every time, not just when the play is near.</w:t>
-            </w:r>
-          </w:p>
-          <w:p>
-            <w:pPr>
-              <w:pStyle w:val="Normal"/>
-              <w:spacing w:before="0" w:after="40"/>
-              <w:rPr/>
-            </w:pPr>
-            <w:r>
-              <w:rPr>
-                <w:rFonts w:eastAsia="Calibri" w:cs="Calibri"/>
-                <w:b w:val="false"/>
-                <w:bCs w:val="false"/>
-                <w:sz w:val="20"/>
-                <w:szCs w:val="20"/>
-              </w:rPr>
-              <w:t>Second and third effort after losing a battle.</w:t>
-            </w:r>
-          </w:p>
-          <w:p>
-            <w:pPr>
-              <w:pStyle w:val="Normal"/>
-              <w:spacing w:before="0" w:after="40"/>
-              <w:rPr/>
-            </w:pPr>
-            <w:r>
-              <w:rPr>
-                <w:rFonts w:eastAsia="Calibri" w:cs="Calibri"/>
-                <w:b w:val="false"/>
-                <w:bCs w:val="false"/>
-                <w:sz w:val="20"/>
-                <w:szCs w:val="20"/>
-              </w:rPr>
-              <w:t>Goes to the hard areas (net front, corners) without being told.</w:t>
-            </w:r>
-          </w:p>
-          <w:p>
-            <w:pPr>
-              <w:pStyle w:val="Normal"/>
-              <w:spacing w:before="0" w:after="40"/>
-              <w:rPr/>
-            </w:pPr>
-            <w:r>
-              <w:rPr>
-                <w:rFonts w:eastAsia="Calibri" w:cs="Calibri"/>
-                <w:b w:val="false"/>
-                <w:bCs w:val="false"/>
-                <w:sz w:val="20"/>
-                <w:szCs w:val="20"/>
-              </w:rPr>
-              <w:t>Same effort in drills as in scrimmage.</w:t>
+          </w:tcPr>
+          <w:p>
+            <w:pPr>
+              <w:pStyle w:val="Normal"/>
+              <w:spacing w:before="0" w:after="40"/>
+              <w:rPr/>
+            </w:pPr>
+            <w:r>
+              <w:rPr>
+                <w:rFonts w:eastAsia="Calibri" w:cs="Calibri"/>
+                <w:b w:val="false"/>
+                <w:bCs w:val="false"/>
+                <w:sz w:val="20"/>
+                <w:szCs w:val="20"/>
+              </w:rPr>
+              <w:t>In the right place before the puck arrives.</w:t>
+            </w:r>
+          </w:p>
+          <w:p>
+            <w:pPr>
+              <w:pStyle w:val="Normal"/>
+              <w:spacing w:before="0" w:after="40"/>
+              <w:rPr/>
+            </w:pPr>
+            <w:r>
+              <w:rPr>
+                <w:rFonts w:eastAsia="Calibri" w:cs="Calibri"/>
+                <w:b w:val="false"/>
+                <w:bCs w:val="false"/>
+                <w:sz w:val="20"/>
+                <w:szCs w:val="20"/>
+              </w:rPr>
+              <w:t>Supports the puck carrier: gets open, gives a passing option.</w:t>
+            </w:r>
+          </w:p>
+          <w:p>
+            <w:pPr>
+              <w:pStyle w:val="Normal"/>
+              <w:spacing w:before="0" w:after="40"/>
+              <w:rPr/>
+            </w:pPr>
+            <w:r>
+              <w:rPr>
+                <w:rFonts w:eastAsia="Calibri" w:cs="Calibri"/>
+                <w:b w:val="false"/>
+                <w:bCs w:val="false"/>
+                <w:sz w:val="20"/>
+                <w:szCs w:val="20"/>
+              </w:rPr>
+              <w:t>Reads the play: anticipates turnovers, sees the second pass.</w:t>
+            </w:r>
+          </w:p>
+          <w:p>
+            <w:pPr>
+              <w:pStyle w:val="Normal"/>
+              <w:spacing w:before="0" w:after="40"/>
+              <w:rPr/>
+            </w:pPr>
+            <w:r>
+              <w:rPr>
+                <w:rFonts w:eastAsia="Calibri" w:cs="Calibri"/>
+                <w:b w:val="false"/>
+                <w:bCs w:val="false"/>
+                <w:sz w:val="20"/>
+                <w:szCs w:val="20"/>
+              </w:rPr>
+              <w:t>Makes the simple play when the fancy one is not there.</w:t>
+            </w:r>
+          </w:p>
+          <w:p>
+            <w:pPr>
+              <w:pStyle w:val="Normal"/>
+              <w:spacing w:before="0" w:after="40"/>
+              <w:rPr/>
+            </w:pPr>
+            <w:r>
+              <w:rPr>
+                <w:rFonts w:eastAsia="Calibri" w:cs="Calibri"/>
+                <w:b w:val="false"/>
+                <w:bCs w:val="false"/>
+                <w:sz w:val="20"/>
+                <w:szCs w:val="20"/>
+              </w:rPr>
+              <w:t>Recognises odd-man situations for and against and adjusts.</w:t>
             </w:r>
           </w:p>
         </w:tc>
@@ -2002,23 +1966,22 @@
               <w:bottom w:val="single" w:sz="4" w:space="0" w:color="000000"/>
               <w:end w:val="single" w:sz="4" w:space="0" w:color="000000"/>
             </w:tcBorders>
-            <w:shd w:color="auto" w:fill="EAF0F7" w:val="clear"/>
-          </w:tcPr>
-          <w:p>
-            <w:pPr>
-              <w:pStyle w:val="Normal"/>
-              <w:spacing w:before="0" w:after="40"/>
-              <w:rPr/>
-            </w:pPr>
-            <w:r>
-              <w:rPr>
-                <w:rFonts w:eastAsia="Calibri" w:cs="Calibri"/>
-                <w:b w:val="false"/>
-                <w:bCs w:val="false"/>
-                <w:sz w:val="20"/>
-                <w:szCs w:val="20"/>
-              </w:rPr>
-              <w:t>Coasts in drills. Watches the play after a turnover. Avoids contact and corners. Effort drops after a bad shift or a goal against. Only battles when the coach is watching.</w:t>
+          </w:tcPr>
+          <w:p>
+            <w:pPr>
+              <w:pStyle w:val="Normal"/>
+              <w:spacing w:before="0" w:after="40"/>
+              <w:rPr/>
+            </w:pPr>
+            <w:r>
+              <w:rPr>
+                <w:rFonts w:eastAsia="Calibri" w:cs="Calibri"/>
+                <w:b w:val="false"/>
+                <w:bCs w:val="false"/>
+                <w:sz w:val="20"/>
+                <w:szCs w:val="20"/>
+              </w:rPr>
+              <w:t>Chases the puck. Bunches up with teammates. Stands still without the puck. Makes the same wrong read repeatedly. Only looks good when the puck is on their stick.</w:t>
             </w:r>
           </w:p>
         </w:tc>
@@ -2036,6 +1999,7 @@
               <w:bottom w:val="single" w:sz="4" w:space="0" w:color="000000"/>
               <w:end w:val="single" w:sz="4" w:space="0" w:color="000000"/>
             </w:tcBorders>
+            <w:shd w:color="auto" w:fill="EAF0F7" w:val="clear"/>
           </w:tcPr>
           <w:p>
             <w:pPr>
@@ -2051,7 +2015,7 @@
                 <w:sz w:val="20"/>
                 <w:szCs w:val="20"/>
               </w:rPr>
-              <w:t>Coachability (weight 0.5)</w:t>
+              <w:t>Compete Level (weight 1.5)</w:t>
             </w:r>
           </w:p>
         </w:tc>
@@ -2064,73 +2028,91 @@
               <w:bottom w:val="single" w:sz="4" w:space="0" w:color="000000"/>
               <w:end w:val="single" w:sz="4" w:space="0" w:color="000000"/>
             </w:tcBorders>
-          </w:tcPr>
-          <w:p>
-            <w:pPr>
-              <w:pStyle w:val="Normal"/>
-              <w:spacing w:before="0" w:after="40"/>
-              <w:rPr/>
-            </w:pPr>
-            <w:r>
-              <w:rPr>
-                <w:rFonts w:eastAsia="Calibri" w:cs="Calibri"/>
-                <w:b w:val="false"/>
-                <w:bCs w:val="false"/>
-                <w:sz w:val="20"/>
-                <w:szCs w:val="20"/>
-              </w:rPr>
-              <w:t>Listens when the drill is explained; executes it as described the first time.</w:t>
-            </w:r>
-          </w:p>
-          <w:p>
-            <w:pPr>
-              <w:pStyle w:val="Normal"/>
-              <w:spacing w:before="0" w:after="40"/>
-              <w:rPr/>
-            </w:pPr>
-            <w:r>
-              <w:rPr>
-                <w:rFonts w:eastAsia="Calibri" w:cs="Calibri"/>
-                <w:b w:val="false"/>
-                <w:bCs w:val="false"/>
-                <w:sz w:val="20"/>
-                <w:szCs w:val="20"/>
-              </w:rPr>
-              <w:t>First in line, ready to go, does not need to be told twice.</w:t>
-            </w:r>
-          </w:p>
-          <w:p>
-            <w:pPr>
-              <w:pStyle w:val="Normal"/>
-              <w:spacing w:before="0" w:after="40"/>
-              <w:rPr/>
-            </w:pPr>
-            <w:r>
-              <w:rPr>
-                <w:rFonts w:eastAsia="Calibri" w:cs="Calibri"/>
-                <w:b w:val="false"/>
-                <w:bCs w:val="false"/>
-                <w:sz w:val="20"/>
-                <w:szCs w:val="20"/>
-              </w:rPr>
-              <w:t>Positive with teammates; encourages, does not blame.</w:t>
-            </w:r>
-          </w:p>
-          <w:p>
-            <w:pPr>
-              <w:pStyle w:val="Normal"/>
-              <w:spacing w:before="0" w:after="40"/>
-              <w:rPr/>
-            </w:pPr>
-            <w:r>
-              <w:rPr>
-                <w:rFonts w:eastAsia="Calibri" w:cs="Calibri"/>
-                <w:b w:val="false"/>
-                <w:bCs w:val="false"/>
-                <w:sz w:val="20"/>
-                <w:szCs w:val="20"/>
-              </w:rPr>
-              <w:t>Responds to correction by trying it the new way.</w:t>
+            <w:shd w:color="auto" w:fill="EAF0F7" w:val="clear"/>
+          </w:tcPr>
+          <w:p>
+            <w:pPr>
+              <w:pStyle w:val="Normal"/>
+              <w:spacing w:before="0" w:after="40"/>
+              <w:rPr/>
+            </w:pPr>
+            <w:r>
+              <w:rPr>
+                <w:rFonts w:eastAsia="Calibri" w:cs="Calibri"/>
+                <w:b w:val="false"/>
+                <w:bCs w:val="false"/>
+                <w:sz w:val="20"/>
+                <w:szCs w:val="20"/>
+              </w:rPr>
+              <w:t>Wins or at least contests every puck battle along the boards.</w:t>
+            </w:r>
+          </w:p>
+          <w:p>
+            <w:pPr>
+              <w:pStyle w:val="Normal"/>
+              <w:spacing w:before="0" w:after="40"/>
+              <w:rPr/>
+            </w:pPr>
+            <w:r>
+              <w:rPr>
+                <w:rFonts w:eastAsia="Calibri" w:cs="Calibri"/>
+                <w:b w:val="false"/>
+                <w:bCs w:val="false"/>
+                <w:sz w:val="20"/>
+                <w:szCs w:val="20"/>
+              </w:rPr>
+              <w:t>Back-checks every time, not just when the play is near.</w:t>
+            </w:r>
+          </w:p>
+          <w:p>
+            <w:pPr>
+              <w:pStyle w:val="Normal"/>
+              <w:spacing w:before="0" w:after="40"/>
+              <w:rPr/>
+            </w:pPr>
+            <w:r>
+              <w:rPr>
+                <w:rFonts w:eastAsia="Calibri" w:cs="Calibri"/>
+                <w:b w:val="false"/>
+                <w:bCs w:val="false"/>
+                <w:sz w:val="20"/>
+                <w:szCs w:val="20"/>
+              </w:rPr>
+              <w:t>Second and third effort after losing a battle.</w:t>
+            </w:r>
+          </w:p>
+          <w:p>
+            <w:pPr>
+              <w:pStyle w:val="Normal"/>
+              <w:spacing w:before="0" w:after="40"/>
+              <w:rPr/>
+            </w:pPr>
+            <w:r>
+              <w:rPr>
+                <w:rFonts w:eastAsia="Calibri" w:cs="Calibri"/>
+                <w:b w:val="false"/>
+                <w:bCs w:val="false"/>
+                <w:sz w:val="20"/>
+                <w:szCs w:val="20"/>
+              </w:rPr>
+              <w:t>Goes to the hard areas (net front, corners) without being told.</w:t>
+            </w:r>
+          </w:p>
+          <w:p>
+            <w:pPr>
+              <w:pStyle w:val="Normal"/>
+              <w:spacing w:before="0" w:after="40"/>
+              <w:rPr/>
+            </w:pPr>
+            <w:r>
+              <w:rPr>
+                <w:rFonts w:eastAsia="Calibri" w:cs="Calibri"/>
+                <w:b w:val="false"/>
+                <w:bCs w:val="false"/>
+                <w:sz w:val="20"/>
+                <w:szCs w:val="20"/>
+              </w:rPr>
+              <w:t>Same effort in drills as in scrimmage.</w:t>
             </w:r>
           </w:p>
         </w:tc>
@@ -2143,22 +2125,23 @@
               <w:bottom w:val="single" w:sz="4" w:space="0" w:color="000000"/>
               <w:end w:val="single" w:sz="4" w:space="0" w:color="000000"/>
             </w:tcBorders>
-          </w:tcPr>
-          <w:p>
-            <w:pPr>
-              <w:pStyle w:val="Normal"/>
-              <w:spacing w:before="0" w:after="40"/>
-              <w:rPr/>
-            </w:pPr>
-            <w:r>
-              <w:rPr>
-                <w:rFonts w:eastAsia="Calibri" w:cs="Calibri"/>
-                <w:b w:val="false"/>
-                <w:bCs w:val="false"/>
-                <w:sz w:val="20"/>
-                <w:szCs w:val="20"/>
-              </w:rPr>
-              <w:t>Talks during instruction. Does the drill their own way. Sulks after a mistake or a correction. Last in line, slow to the bench, wanders during water breaks.</w:t>
+            <w:shd w:color="auto" w:fill="EAF0F7" w:val="clear"/>
+          </w:tcPr>
+          <w:p>
+            <w:pPr>
+              <w:pStyle w:val="Normal"/>
+              <w:spacing w:before="0" w:after="40"/>
+              <w:rPr/>
+            </w:pPr>
+            <w:r>
+              <w:rPr>
+                <w:rFonts w:eastAsia="Calibri" w:cs="Calibri"/>
+                <w:b w:val="false"/>
+                <w:bCs w:val="false"/>
+                <w:sz w:val="20"/>
+                <w:szCs w:val="20"/>
+              </w:rPr>
+              <w:t>Coasts in drills. Watches the play after a turnover. Avoids contact and corners. Effort drops after a bad shift or a goal against. Only battles when the coach is watching.</w:t>
             </w:r>
           </w:p>
         </w:tc>
@@ -3547,21 +3530,6 @@
     </w:p>
     <w:p>
       <w:pPr>
-        <w:pStyle w:val="Normal"/>
-        <w:spacing w:before="0" w:after="120"/>
-        <w:rPr/>
-      </w:pPr>
-      <w:r>
-        <w:rPr>
-          <w:rFonts w:eastAsia="Calibri" w:cs="Calibri"/>
-          <w:sz w:val="22"/>
-          <w:szCs w:val="22"/>
-        </w:rPr>
-        <w:t>Goalie coachability is scored the same way as for skaters.</w:t>
-      </w:r>
-    </w:p>
-    <w:p>
-      <w:pPr>
         <w:pStyle w:val="Heading1"/>
         <w:spacing w:before="320" w:after="120"/>
         <w:rPr/>
@@ -4310,7 +4278,7 @@
                 <w:sz w:val="20"/>
                 <w:szCs w:val="20"/>
               </w:rPr>
-              <w:t>Skating · Puck Control · Passing · Shooting · Hockey Sense · Compete Level · Coachability, plus Defensive Play (D) or Offensive Play (F)</w:t>
+              <w:t>Skating Speed · Skating Mobility · Puck Control · Passing · Shooting · Hockey Sense · Compete Level, plus Defensive Play (D) or Offensive Play (F)</w:t>
             </w:r>
           </w:p>
         </w:tc>
@@ -4373,7 +4341,7 @@
                 <w:sz w:val="20"/>
                 <w:szCs w:val="20"/>
               </w:rPr>
-              <w:t>Crease Movement · Save Technique · Rebound Control · Game Awareness · Compete Level · Coachability</w:t>
+              <w:t>Crease Movement · Save Technique · Rebound Control · Game Awareness · Compete Level</w:t>
             </w:r>
           </w:p>
         </w:tc>

</xml_diff>